<commit_message>
Update Tatvam Jalam documentation docs (Technical Journey, Technical Journey-1, User Guide)
</commit_message>
<xml_diff>
--- a/Tatva_Jalam_Technical_Journey.docx
+++ b/Tatva_Jalam_Technical_Journey.docx
@@ -16,7 +16,7 @@
           <w:sz w:val="52"/>
           <w:szCs w:val="52"/>
         </w:rPr>
-        <w:t>तत्त्व-जालम्  ·  Tatva Jalam</w:t>
+        <w:t xml:space="preserve">तत्त्व-जालम्  ·  Tatvam Jalam</w:t>
       </w:r>
     </w:p>
     <w:p>
@@ -306,7 +306,7 @@
           <w:sz w:val="22"/>
           <w:szCs w:val="22"/>
         </w:rPr>
-        <w:t>Tatva Jalam (तत्त्व-जालम् — 'The Web of Tattvas') is a self-contained interactive web application that maps the Bhagavad Gītā's philosophical concepts as a navigable knowledge graph, rooted in the Madhva Vedānta tradition and the commentaries of Bannanje Govindacharya.</w:t>
+        <w:t xml:space="preserve">Tatvam Jalam (तत्त्व-जालम् — 'The Web of Tattvas') is a self-contained interactive web application that maps the Bhagavad Gītā's philosophical concepts as a navigable knowledge graph, rooted in the Madhva Vedānta tradition and the commentaries of Bannanje Govindacharya.</w:t>
       </w:r>
     </w:p>
     <w:p>
@@ -2305,7 +2305,7 @@
           <w:sz w:val="24"/>
           <w:szCs w:val="24"/>
         </w:rPr>
-        <w:t>Tatva Jalam rebranding</w:t>
+        <w:t xml:space="preserve">Tatvam Jalam rebranding</w:t>
       </w:r>
     </w:p>
     <w:p>
@@ -2319,7 +2319,7 @@
           <w:sz w:val="22"/>
           <w:szCs w:val="22"/>
         </w:rPr>
-        <w:t>'Sankalpana Kosha' (Concept Repository) was replaced with 'Tatva Jalam' (तत्त्व-जालम् — The Web of Tattvas). The name chosen because (a) jāla / 'web' maps directly onto the knowledge graph metaphor, (b) tattva is central to Madhva philosophy, and (c) it reads naturally in all four languages.</w:t>
+        <w:t xml:space="preserve">'Sankalpana Kosha' (Concept Repository) was replaced with 'Tatvam Jalam' (तत्त्व-जालम् — The Web of Tattvas). The name chosen because (a) jāla / 'web' maps directly onto the knowledge graph metaphor, (b) tattva is central to Madhva philosophy, and (c) it reads naturally in all four languages.</w:t>
       </w:r>
     </w:p>
     <w:p>

</xml_diff>